<commit_message>
docs: regenerate all Word documents for consistency
Rebuild RTM, Library Reference, and Installation Guide after RTM
audit and test-vector translation to ensure all three docs share
the same corrected test names, vector IDs, and coverage ratings.

https://claude.ai/code/session_01HgZCEYrVJows6W6wid54B2
</commit_message>
<xml_diff>
--- a/ipad_lib_sgp32/ipad_lib/doc/IPAd_Library_Reference.docx
+++ b/ipad_lib_sgp32/ipad_lib/doc/IPAd_Library_Reference.docx
@@ -116,7 +116,7 @@
         <w:rPr>
           <w:sz w:val="22"/>
         </w:rPr>
-        <w:t>May 31, 2026</w:t>
+        <w:t>June 01, 2026</w:t>
       </w:r>
     </w:p>
     <w:p>
@@ -14156,7 +14156,7 @@
               <w:rPr>
                 <w:sz w:val="18"/>
               </w:rPr>
-              <w:t>2026-05-31</w:t>
+              <w:t>2026-06-01</w:t>
             </w:r>
           </w:p>
         </w:tc>
@@ -14187,7 +14187,7 @@
           <w:color w:val="888888"/>
           <w:sz w:val="16"/>
         </w:rPr>
-        <w:t>IPAd Library v1.0.0  ·  GSMA SGP.32  ·  Qualcomm SA525  ·  Generated May 31, 2026</w:t>
+        <w:t>IPAd Library v1.0.0  ·  GSMA SGP.32  ·  Qualcomm SA525  ·  Generated June 01, 2026</w:t>
       </w:r>
     </w:p>
     <w:sectPr>

</xml_diff>